<commit_message>
Highlight partner, alliance, and channel experience on portfolio
- Fix broken resume download link (pointed to a missing file)
- Hero leads with partner value statement and three proof stats
- New Partner Ecosystems section (Google Cloud, Azure, VAR channel)
  with a five-step partner motion lifecycle
- Track Record now uses partner-specific metrics
- Replace direct-sales API case study with ISI VAR channel and
  Azure Marketplace case study
- Move podcast out of hero into its own section
- Add "best fit" roles line to contact section
- Align About copy with resume (Google Cloud partner)
- Update resume file with corrected wording

Co-Authored-By: Claude Opus 5.5 <noreply@anthropic.com>
Claude-Session: https://claude.ai/code/session_01KKTPUXkM3bAiSt2LMFGy3y
</commit_message>
<xml_diff>
--- a/assets/files/rch-26.docx
+++ b/assets/files/rch-26.docx
@@ -278,16 +278,6 @@
       <w:pPr>
         <w:pStyle w:val="Heading1"/>
       </w:pPr>
-      <w:r>
-        <w:rPr>
-          <w:rFonts w:asciiTheme="minorHAnsi" w:eastAsiaTheme="minorHAnsi" w:hAnsiTheme="minorHAnsi" w:cstheme="minorBidi"/>
-          <w:b w:val="0"/>
-          <w:spacing w:val="0"/>
-          <w:sz w:val="20"/>
-          <w:szCs w:val="22"/>
-        </w:rPr>
-        <w:t>I</w:t>
-      </w:r>
       <w:sdt>
         <w:sdtPr>
           <w:id w:val="1494989950"/>
@@ -373,7 +363,7 @@
               </wp:inline>
             </w:drawing>
           </mc:Choice>
-          <mc:Fallback xmlns:arto="http://schemas.microsoft.com/office/word/2006/arto" xmlns:adec="http://schemas.microsoft.com/office/drawing/2017/decorative" xmlns:a="http://schemas.openxmlformats.org/drawingml/2006/main">
+          <mc:Fallback xmlns:a="http://schemas.openxmlformats.org/drawingml/2006/main" xmlns:adec="http://schemas.microsoft.com/office/drawing/2017/decorative" xmlns:arto="http://schemas.microsoft.com/office/word/2006/arto">
             <w:pict>
               <v:line id="Straight Connector 1" style="visibility:visible;mso-wrap-style:square;mso-left-percent:-10001;mso-top-percent:-10001;mso-position-horizontal:absolute;mso-position-horizontal-relative:char;mso-position-vertical:absolute;mso-position-vertical-relative:line;mso-left-percent:-10001;mso-top-percent:-10001" alt="&quot;&quot;" o:spid="_x0000_s1026" strokecolor="black [3213]" strokeweight="1pt" from="0,0" to="468pt,0" w14:anchorId="0F35E36A" o:gfxdata="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">
                 <v:stroke joinstyle="miter"/>
@@ -479,7 +469,7 @@
           <w:rFonts w:ascii="Arial" w:eastAsia="Arial" w:hAnsi="Arial" w:cs="Arial"/>
           <w:szCs w:val="20"/>
         </w:rPr>
-        <w:t>Partner &amp; Alliance Cloud Sales Leader."</w:t>
+        <w:t/>
       </w:r>
       <w:r>
         <w:rPr>
@@ -781,10 +771,10 @@
         <w:t xml:space="preserve"> </w:t>
       </w:r>
       <w:r>
-        <w:t xml:space="preserve">partner led </w:t>
+        <w:t xml:space="preserve">partner-led </w:t>
       </w:r>
       <w:r>
-        <w:t>sales, and pricing into a unified GTM motion.</w:t>
+        <w:t>sales by unifying partner, direct, and pricing strategy into one GTM motion.</w:t>
       </w:r>
     </w:p>
     <w:p>
@@ -985,7 +975,7 @@
         <w:spacing w:after="0"/>
       </w:pPr>
       <w:r>
-        <w:t xml:space="preserve">Built the forecasting, pipeline hygiene, and reporting systems the acquirer </w:t>
+        <w:t xml:space="preserve">Built the forecasting, pipeline hygiene, and reporting systems the acquirer relied on in </w:t>
       </w:r>
       <w:r>
         <w:t>diligence</w:t>
@@ -1257,7 +1247,7 @@
               </wp:inline>
             </w:drawing>
           </mc:Choice>
-          <mc:Fallback xmlns:arto="http://schemas.microsoft.com/office/word/2006/arto" xmlns:adec="http://schemas.microsoft.com/office/drawing/2017/decorative" xmlns:a="http://schemas.openxmlformats.org/drawingml/2006/main">
+          <mc:Fallback xmlns:a="http://schemas.openxmlformats.org/drawingml/2006/main" xmlns:adec="http://schemas.microsoft.com/office/drawing/2017/decorative" xmlns:arto="http://schemas.microsoft.com/office/word/2006/arto">
             <w:pict>
               <v:line id="Straight Connector 1" style="visibility:visible;mso-wrap-style:square;mso-left-percent:-10001;mso-top-percent:-10001;mso-position-horizontal:absolute;mso-position-horizontal-relative:char;mso-position-vertical:absolute;mso-position-vertical-relative:line;mso-left-percent:-10001;mso-top-percent:-10001" alt="&quot;&quot;" o:spid="_x0000_s1026" strokecolor="black [3213]" strokeweight="1pt" from="0,0" to="468pt,0" w14:anchorId="16600522" o:gfxdata="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">
                 <v:stroke joinstyle="miter"/>
@@ -1400,7 +1390,7 @@
               </wp:inline>
             </w:drawing>
           </mc:Choice>
-          <mc:Fallback xmlns:arto="http://schemas.microsoft.com/office/word/2006/arto" xmlns:adec="http://schemas.microsoft.com/office/drawing/2017/decorative" xmlns:a="http://schemas.openxmlformats.org/drawingml/2006/main">
+          <mc:Fallback xmlns:a="http://schemas.openxmlformats.org/drawingml/2006/main" xmlns:adec="http://schemas.microsoft.com/office/drawing/2017/decorative" xmlns:arto="http://schemas.microsoft.com/office/word/2006/arto">
             <w:pict>
               <v:line id="Straight Connector 1" style="visibility:visible;mso-wrap-style:square;mso-left-percent:-10001;mso-top-percent:-10001;mso-position-horizontal:absolute;mso-position-horizontal-relative:char;mso-position-vertical:absolute;mso-position-vertical-relative:line;mso-left-percent:-10001;mso-top-percent:-10001" alt="&quot;&quot;" o:spid="_x0000_s1026" strokecolor="black [3213]" strokeweight="1pt" from="0,0" to="468pt,0" w14:anchorId="40899CD0" o:gfxdata="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">
                 <v:stroke joinstyle="miter"/>
@@ -29340,7 +29330,6 @@
     <w:rsid w:val="00284DAA"/>
     <w:rsid w:val="002B5F74"/>
     <w:rsid w:val="00445A1D"/>
-    <w:rsid w:val="00464A0C"/>
     <w:rsid w:val="00610C7E"/>
     <w:rsid w:val="006574C2"/>
     <w:rsid w:val="006819AC"/>
@@ -30079,19 +30068,6 @@
 </file>
 
 <file path=customXml/item1.xml><?xml version="1.0" encoding="utf-8"?>
-<b:Sources xmlns:b="http://schemas.openxmlformats.org/officeDocument/2006/bibliography" xmlns="http://schemas.openxmlformats.org/officeDocument/2006/bibliography" SelectedStyle="\APASixthEditionOfficeOnline.xsl" StyleName="APA" Version="6"/>
-</file>
-
-<file path=customXml/item2.xml><?xml version="1.0" encoding="utf-8"?>
-<?mso-contentType ?>
-<FormTemplates xmlns="http://schemas.microsoft.com/sharepoint/v3/contenttype/forms">
-  <Display>DocumentLibraryForm</Display>
-  <Edit>DocumentLibraryForm</Edit>
-  <New>DocumentLibraryForm</New>
-</FormTemplates>
-</file>
-
-<file path=customXml/item3.xml><?xml version="1.0" encoding="utf-8"?>
 <ct:contentTypeSchema xmlns:ct="http://schemas.microsoft.com/office/2006/metadata/contentType" xmlns:ma="http://schemas.microsoft.com/office/2006/metadata/properties/metaAttributes" ct:_="" ma:_="" ma:contentTypeName="Document" ma:contentTypeID="0x01010079F111ED35F8CC479449609E8A0923A6" ma:contentTypeVersion="26" ma:contentTypeDescription="Create a new document." ma:contentTypeScope="" ma:versionID="ac37c1753acd5e330d2062ccec26ea66">
   <xsd:schema xmlns:xsd="http://www.w3.org/2001/XMLSchema" xmlns:xs="http://www.w3.org/2001/XMLSchema" xmlns:p="http://schemas.microsoft.com/office/2006/metadata/properties" xmlns:ns1="http://schemas.microsoft.com/sharepoint/v3" xmlns:ns2="71af3243-3dd4-4a8d-8c0d-dd76da1f02a5" xmlns:ns3="16c05727-aa75-4e4a-9b5f-8a80a1165891" xmlns:ns4="230e9df3-be65-4c73-a93b-d1236ebd677e" targetNamespace="http://schemas.microsoft.com/office/2006/metadata/properties" ma:root="true" ma:fieldsID="3b340c7101c92c5120abd06486f94548" ns1:_="" ns2:_="" ns3:_="" ns4:_="">
     <xsd:import namespace="http://schemas.microsoft.com/sharepoint/v3"/>
@@ -30391,6 +30367,19 @@
 </ct:contentTypeSchema>
 </file>
 
+<file path=customXml/item2.xml><?xml version="1.0" encoding="utf-8"?>
+<?mso-contentType ?>
+<FormTemplates xmlns="http://schemas.microsoft.com/sharepoint/v3/contenttype/forms">
+  <Display>DocumentLibraryForm</Display>
+  <Edit>DocumentLibraryForm</Edit>
+  <New>DocumentLibraryForm</New>
+</FormTemplates>
+</file>
+
+<file path=customXml/item3.xml><?xml version="1.0" encoding="utf-8"?>
+<b:Sources xmlns:b="http://schemas.openxmlformats.org/officeDocument/2006/bibliography" xmlns="http://schemas.openxmlformats.org/officeDocument/2006/bibliography" SelectedStyle="\APASixthEditionOfficeOnline.xsl" StyleName="APA" Version="6"/>
+</file>
+
 <file path=customXml/item4.xml><?xml version="1.0" encoding="utf-8"?>
 <p:properties xmlns:p="http://schemas.microsoft.com/office/2006/metadata/properties" xmlns:xsi="http://www.w3.org/2001/XMLSchema-instance" xmlns:pc="http://schemas.microsoft.com/office/infopath/2007/PartnerControls">
   <documentManagement>
@@ -30412,10 +30401,16 @@
 </file>
 
 <file path=customXml/itemProps1.xml><?xml version="1.0" encoding="utf-8"?>
-<ds:datastoreItem xmlns:ds="http://schemas.openxmlformats.org/officeDocument/2006/customXml" ds:itemID="{B690CEF4-07C7-4C0C-A6BB-7328017E8EDA}">
+<ds:datastoreItem xmlns:ds="http://schemas.openxmlformats.org/officeDocument/2006/customXml" ds:itemID="{46268ACC-32FC-4261-BF80-5F6DE34E1C11}">
   <ds:schemaRefs>
-    <ds:schemaRef ds:uri="http://schemas.openxmlformats.org/officeDocument/2006/bibliography"/>
+    <ds:schemaRef ds:uri="http://schemas.microsoft.com/office/2006/metadata/contentType"/>
+    <ds:schemaRef ds:uri="http://schemas.microsoft.com/office/2006/metadata/properties/metaAttributes"/>
     <ds:schemaRef ds:uri="http://www.w3.org/2000/xmlns/"/>
+    <ds:schemaRef ds:uri="http://www.w3.org/2001/XMLSchema"/>
+    <ds:schemaRef ds:uri="http://schemas.microsoft.com/sharepoint/v3"/>
+    <ds:schemaRef ds:uri="71af3243-3dd4-4a8d-8c0d-dd76da1f02a5"/>
+    <ds:schemaRef ds:uri="16c05727-aa75-4e4a-9b5f-8a80a1165891"/>
+    <ds:schemaRef ds:uri="230e9df3-be65-4c73-a93b-d1236ebd677e"/>
   </ds:schemaRefs>
 </ds:datastoreItem>
 </file>
@@ -30429,16 +30424,10 @@
 </file>
 
 <file path=customXml/itemProps3.xml><?xml version="1.0" encoding="utf-8"?>
-<ds:datastoreItem xmlns:ds="http://schemas.openxmlformats.org/officeDocument/2006/customXml" ds:itemID="{46268ACC-32FC-4261-BF80-5F6DE34E1C11}">
+<ds:datastoreItem xmlns:ds="http://schemas.openxmlformats.org/officeDocument/2006/customXml" ds:itemID="{B690CEF4-07C7-4C0C-A6BB-7328017E8EDA}">
   <ds:schemaRefs>
-    <ds:schemaRef ds:uri="http://schemas.microsoft.com/office/2006/metadata/contentType"/>
-    <ds:schemaRef ds:uri="http://schemas.microsoft.com/office/2006/metadata/properties/metaAttributes"/>
+    <ds:schemaRef ds:uri="http://schemas.openxmlformats.org/officeDocument/2006/bibliography"/>
     <ds:schemaRef ds:uri="http://www.w3.org/2000/xmlns/"/>
-    <ds:schemaRef ds:uri="http://www.w3.org/2001/XMLSchema"/>
-    <ds:schemaRef ds:uri="http://schemas.microsoft.com/sharepoint/v3"/>
-    <ds:schemaRef ds:uri="71af3243-3dd4-4a8d-8c0d-dd76da1f02a5"/>
-    <ds:schemaRef ds:uri="16c05727-aa75-4e4a-9b5f-8a80a1165891"/>
-    <ds:schemaRef ds:uri="230e9df3-be65-4c73-a93b-d1236ebd677e"/>
   </ds:schemaRefs>
 </ds:datastoreItem>
 </file>

</xml_diff>